<commit_message>
docs: add live Vercel application URL to final capstone docx metadata table and readme
</commit_message>
<xml_diff>
--- a/Capstone_Project_Final_Report_Mehedi_Hossen_Fahim.docx
+++ b/Capstone_Project_Final_Report_Mehedi_Hossen_Fahim.docx
@@ -156,6 +156,53 @@
                 <w:color w:val="0F172A"/>
                 <w:sz w:val="19"/>
               </w:rPr>
+              <w:t>Live Deployed Application:</w:t>
+            </w:r>
+          </w:p>
+        </w:tc>
+        <w:tc>
+          <w:tcPr>
+            <w:tcW w:type="dxa" w:w="6192"/>
+            <w:shd w:val="clear" w:color="auto" w:fill="F8FAFC"/>
+            <w:tcMar>
+              <w:top w:w="70" w:type="dxa"/>
+              <w:bottom w:w="70" w:type="dxa"/>
+              <w:left w:w="110" w:type="dxa"/>
+              <w:right w:w="110" w:type="dxa"/>
+            </w:tcMar>
+          </w:tcPr>
+          <w:p>
+            <w:r>
+              <w:rPr>
+                <w:rFonts w:ascii="Arial" w:hAnsi="Arial"/>
+                <w:color w:val="0F172A"/>
+                <w:sz w:val="19"/>
+              </w:rPr>
+              <w:t>https://frontend-delta-three-79.vercel.app/</w:t>
+            </w:r>
+          </w:p>
+        </w:tc>
+      </w:tr>
+      <w:tr>
+        <w:tc>
+          <w:tcPr>
+            <w:tcW w:type="dxa" w:w="3168"/>
+            <w:shd w:val="clear" w:color="auto" w:fill="F1F5F9"/>
+            <w:tcMar>
+              <w:top w:w="70" w:type="dxa"/>
+              <w:bottom w:w="70" w:type="dxa"/>
+              <w:left w:w="110" w:type="dxa"/>
+              <w:right w:w="110" w:type="dxa"/>
+            </w:tcMar>
+          </w:tcPr>
+          <w:p>
+            <w:r>
+              <w:rPr>
+                <w:rFonts w:ascii="Arial" w:hAnsi="Arial"/>
+                <w:b/>
+                <w:color w:val="0F172A"/>
+                <w:sz w:val="19"/>
+              </w:rPr>
               <w:t>Source Code Repository:</w:t>
             </w:r>
           </w:p>
@@ -203,7 +250,7 @@
                 <w:color w:val="0F172A"/>
                 <w:sz w:val="19"/>
               </w:rPr>
-              <w:t>Live Deployed Platform:</w:t>
+              <w:t>Backend Web Service:</w:t>
             </w:r>
           </w:p>
         </w:tc>
@@ -225,7 +272,7 @@
                 <w:color w:val="0F172A"/>
                 <w:sz w:val="19"/>
               </w:rPr>
-              <w:t>Frontend: Vercel Cloud SPA | Backend: Render ASGI Web Service</w:t>
+              <w:t>https://bilingual-citizen-assistant.onrender.com (FastAPI ASGI Core)</w:t>
             </w:r>
           </w:p>
         </w:tc>
@@ -1748,7 +1795,7 @@
           <w:color w:val="0F172A"/>
           <w:sz w:val="19"/>
         </w:rPr>
-        <w:t>Frontend deployed on Vercel with edge reverse proxy rewrites (/api/*, /health, /ready) seamlessly eliminating cross-origin browser blocking.</w:t>
+        <w:t>Frontend deployed live on Vercel at https://frontend-delta-three-79.vercel.app/ with edge reverse proxy rewrites (/api/*, /health, /ready) seamlessly eliminating cross-origin browser blocking.</w:t>
       </w:r>
     </w:p>
     <w:p>

</xml_diff>